<commit_message>
feat: :sparkles: (Data center) Implements datacenter in level 4
</commit_message>
<xml_diff>
--- a/Fase-1-Diseno-Red-Corporativa/Fase1-VirtualSolutions-Entrega.docx
+++ b/Fase-1-Diseno-Red-Corporativa/Fase1-VirtualSolutions-Entrega.docx
@@ -2419,7 +2419,44 @@
                 <w:sz w:val="19"/>
                 <w:szCs w:val="19"/>
               </w:rPr>
-              <w:t xml:space="preserve">VoIP interno sobre VLAN dedicada con QoS</w:t>
+              <w:t xml:space="preserve">VoIP interno con </w:t>
+            </w:r>
+            <w:r>
+              <w:rPr>
+                <w:b w:val="false"/>
+                <w:bCs w:val="false"/>
+                <w:sz w:val="19"/>
+                <w:szCs w:val="19"/>
+              </w:rPr>
+              <w:t xml:space="preserve">Asterisk + FreePBX</w:t>
+            </w:r>
+            <w:r>
+              <w:rPr>
+                <w:b w:val="false"/>
+                <w:bCs w:val="false"/>
+                <w:sz w:val="19"/>
+                <w:szCs w:val="19"/>
+              </w:rPr>
+              <w:t xml:space="preserve"> (VM </w:t>
+            </w:r>
+            <w:r>
+              <w:rPr>
+                <w:rFonts w:ascii="Consolas" w:cs="Consolas" w:eastAsia="Consolas" w:hAnsi="Consolas"/>
+                <w:b w:val="false"/>
+                <w:bCs w:val="false"/>
+                <w:sz w:val="19"/>
+                <w:szCs w:val="19"/>
+              </w:rPr>
+              <w:t xml:space="preserve">vm-voip</w:t>
+            </w:r>
+            <w:r>
+              <w:rPr>
+                <w:b w:val="false"/>
+                <w:bCs w:val="false"/>
+                <w:sz w:val="19"/>
+                <w:szCs w:val="19"/>
+              </w:rPr>
+              <w:t xml:space="preserve">), VLAN 60 dedicada con QoS</w:t>
             </w:r>
           </w:p>
         </w:tc>
@@ -2513,7 +2550,61 @@
                 <w:sz w:val="19"/>
                 <w:szCs w:val="19"/>
               </w:rPr>
-              <w:t xml:space="preserve">2 enlaces WAN, 2 ISP, failover automático</w:t>
+              <w:t xml:space="preserve">2 enlaces WAN de </w:t>
+            </w:r>
+            <w:r>
+              <w:rPr>
+                <w:b w:val="false"/>
+                <w:bCs w:val="false"/>
+                <w:sz w:val="19"/>
+                <w:szCs w:val="19"/>
+              </w:rPr>
+              <w:t xml:space="preserve">Claro</w:t>
+            </w:r>
+            <w:r>
+              <w:rPr>
+                <w:b w:val="false"/>
+                <w:bCs w:val="false"/>
+                <w:sz w:val="19"/>
+                <w:szCs w:val="19"/>
+              </w:rPr>
+              <w:t xml:space="preserve"> y </w:t>
+            </w:r>
+            <w:r>
+              <w:rPr>
+                <w:b w:val="false"/>
+                <w:bCs w:val="false"/>
+                <w:sz w:val="19"/>
+                <w:szCs w:val="19"/>
+              </w:rPr>
+              <w:t xml:space="preserve">Tigo</w:t>
+            </w:r>
+            <w:r>
+              <w:rPr>
+                <w:b w:val="false"/>
+                <w:bCs w:val="false"/>
+                <w:sz w:val="19"/>
+                <w:szCs w:val="19"/>
+              </w:rPr>
+              <w:t xml:space="preserve"> (proveedores con infraestructura independiente entre sí — evita compartir el mismo punto de falla), </w:t>
+            </w:r>
+            <w:r>
+              <w:rPr>
+                <w:b w:val="false"/>
+                <w:bCs w:val="false"/>
+                <w:sz w:val="19"/>
+                <w:szCs w:val="19"/>
+              </w:rPr>
+              <w:t xml:space="preserve">failover automático</w:t>
+            </w:r>
+            <w:r>
+              <w:rPr>
+                <w:b w:val="false"/>
+                <w:bCs w:val="false"/>
+                <w:sz w:val="19"/>
+                <w:szCs w:val="19"/>
+              </w:rPr>
+              <w:t xml:space="preserve"> en R1 (no balanceo: el enunciado pide explícitamente "redundancia", no más ancho de banda agregado)</w:t>
             </w:r>
           </w:p>
         </w:tc>
@@ -8905,7 +8996,25 @@
                 <w:sz w:val="19"/>
                 <w:szCs w:val="19"/>
               </w:rPr>
-              <w:t xml:space="preserve">Switch de distribución (Data Center, Piso 1)</w:t>
+              <w:t xml:space="preserve">Switch de distribución (Data Center, </w:t>
+            </w:r>
+            <w:r>
+              <w:rPr>
+                <w:b w:val="false"/>
+                <w:bCs w:val="false"/>
+                <w:sz w:val="19"/>
+                <w:szCs w:val="19"/>
+              </w:rPr>
+              <w:t xml:space="preserve">Piso 2</w:t>
+            </w:r>
+            <w:r>
+              <w:rPr>
+                <w:b w:val="false"/>
+                <w:bCs w:val="false"/>
+                <w:sz w:val="19"/>
+                <w:szCs w:val="19"/>
+              </w:rPr>
+              <w:t xml:space="preserve"> — no planta baja, ver 04-Diseno-Fisico.md §1)</w:t>
             </w:r>
           </w:p>
         </w:tc>
@@ -8976,7 +9085,7 @@
                 <w:sz w:val="19"/>
                 <w:szCs w:val="19"/>
               </w:rPr>
-              <w:t xml:space="preserve">3 switches IDF (Piso 2, 3, 4)</w:t>
+              <w:t xml:space="preserve">3 switches IDF (Piso 1, 3, 4)</w:t>
             </w:r>
           </w:p>
         </w:tc>
@@ -9128,7 +9237,23 @@
           <w:sz w:val="21"/>
           <w:szCs w:val="21"/>
         </w:rPr>
-        <w:t xml:space="preserve"> en producción — 1 de distribución en el Data Center (Piso 1, conectado directo a R1) y 3 switches de piso/IDF (Piso 2, 3 y 4), cada uno troncalizado por fibra hacia el de distribución. Cada switch de piso solo transporta las VLANs de las áreas que atiende ese piso. Direccionamiento completo de cada VLAN en 07-Direccionamiento-IP-VLANs.md.</w:t>
+        <w:t xml:space="preserve"> en producción — 1 de distribución en el Data Center (</w:t>
+      </w:r>
+      <w:r>
+        <w:rPr>
+          <w:b/>
+          <w:bCs/>
+          <w:sz w:val="21"/>
+          <w:szCs w:val="21"/>
+        </w:rPr>
+        <w:t xml:space="preserve">Piso 2</w:t>
+      </w:r>
+      <w:r>
+        <w:rPr>
+          <w:sz w:val="21"/>
+          <w:szCs w:val="21"/>
+        </w:rPr>
+        <w:t xml:space="preserve">, no planta baja, por prevención de inundación, conectado directo a R1) y 3 switches de piso/IDF (Piso 1, 3 y 4), cada uno troncalizado por fibra hacia el de distribución. El switch de distribución también sirve directo a Administración y Soporte I/T (VLANs 10 y 40) por estar físicamente en el mismo piso que ellos — no necesitan un IDF propio. Cada switch de piso restante solo transporta las VLANs de las áreas que atiende ese piso. Direccionamiento completo de cada VLAN en 07-Direccionamiento-IP-VLANs.md.</w:t>
       </w:r>
     </w:p>
     <w:p>
@@ -10492,25 +10617,7 @@
                 <w:sz w:val="19"/>
                 <w:szCs w:val="19"/>
               </w:rPr>
-              <w:t xml:space="preserve">Recepción + </w:t>
-            </w:r>
-            <w:r>
-              <w:rPr>
-                <w:b w:val="false"/>
-                <w:bCs w:val="false"/>
-                <w:sz w:val="19"/>
-                <w:szCs w:val="19"/>
-              </w:rPr>
-              <w:t xml:space="preserve">MDF/Data Center</w:t>
-            </w:r>
-            <w:r>
-              <w:rPr>
-                <w:b w:val="false"/>
-                <w:bCs w:val="false"/>
-                <w:sz w:val="19"/>
-                <w:szCs w:val="19"/>
-              </w:rPr>
-              <w:t xml:space="preserve"> + Ventas</w:t>
+              <w:t xml:space="preserve">Recepción + Ventas</w:t>
             </w:r>
           </w:p>
         </w:tc>
@@ -10579,7 +10686,7 @@
                 <w:sz w:val="19"/>
                 <w:szCs w:val="19"/>
               </w:rPr>
-              <w:t xml:space="preserve">El MDF/Data Center vive aquí para minimizar longitud de backbone vertical</w:t>
+              <w:t xml:space="preserve">IDF de piso 1 (ya no aloja el MDF — ver justificación abajo)</w:t>
             </w:r>
           </w:p>
         </w:tc>
@@ -10627,7 +10734,16 @@
                 <w:sz w:val="19"/>
                 <w:szCs w:val="19"/>
               </w:rPr>
-              <w:t xml:space="preserve">Administración + Soporte I/T</w:t>
+              <w:t xml:space="preserve">MDF/Data Center</w:t>
+            </w:r>
+            <w:r>
+              <w:rPr>
+                <w:b w:val="false"/>
+                <w:bCs w:val="false"/>
+                <w:sz w:val="19"/>
+                <w:szCs w:val="19"/>
+              </w:rPr>
+              <w:t xml:space="preserve"> + Administración + Soporte I/T</w:t>
             </w:r>
           </w:p>
         </w:tc>
@@ -10696,7 +10812,7 @@
                 <w:sz w:val="19"/>
                 <w:szCs w:val="19"/>
               </w:rPr>
-              <w:t xml:space="preserve">IDF de piso 2</w:t>
+              <w:t xml:space="preserve">El MDF/Data Center vive aquí — ver justificación abajo</w:t>
             </w:r>
           </w:p>
         </w:tc>
@@ -11057,6 +11173,44 @@
       <w:pPr>
         <w:spacing w:after="200"/>
       </w:pPr>
+    </w:p>
+    <w:p>
+      <w:pPr>
+        <w:spacing w:after="160"/>
+        <w:jc w:val="both"/>
+      </w:pPr>
+      <w:r>
+        <w:rPr>
+          <w:b/>
+          <w:bCs/>
+          <w:sz w:val="21"/>
+          <w:szCs w:val="21"/>
+        </w:rPr>
+        <w:t xml:space="preserve">Por qué el MDF/Data Center está en el Piso 2 y no en el Piso 1</w:t>
+      </w:r>
+      <w:r>
+        <w:rPr>
+          <w:sz w:val="21"/>
+          <w:szCs w:val="21"/>
+        </w:rPr>
+        <w:t xml:space="preserve">: se descartó deliberadamente la planta baja por riesgo de inundación — es una práctica de sitio estándar en el diseño de Data Centers (Uptime Institute / BICSI 002 desaconsejan planta baja y sótano precisamente por exposición a inundación, además de mayor exposición a acceso vehicular/entregas y menor profundidad de seguridad física). El Piso 2 es el primer nivel elevado del edificio, reduciendo ese riesgo sin llevar el equipo pesado (rack 42U, UPS, futura planta eléctrica) más arriba de lo necesario. Como beneficio adicional, coincide con dónde está </w:t>
+      </w:r>
+      <w:r>
+        <w:rPr>
+          <w:b/>
+          <w:bCs/>
+          <w:sz w:val="21"/>
+          <w:szCs w:val="21"/>
+        </w:rPr>
+        <w:t xml:space="preserve">Soporte I/T</w:t>
+      </w:r>
+      <w:r>
+        <w:rPr>
+          <w:sz w:val="21"/>
+          <w:szCs w:val="21"/>
+        </w:rPr>
+        <w:t xml:space="preserve"> — son quienes administran el Data Center día a día, así que tenerlos en el mismo piso reduce el tiempo de respuesta ante cualquier incidente físico (un cambio de patch cord, un reinicio manual, etc.) sin necesidad de subir/bajar pisos.</w:t>
+      </w:r>
     </w:p>
     <w:p>
       <w:pPr>
@@ -11160,6 +11314,35 @@
     </w:p>
     <w:p>
       <w:pPr>
+        <w:spacing w:after="160"/>
+        <w:jc w:val="both"/>
+      </w:pPr>
+      <w:r>
+        <w:rPr>
+          <w:sz w:val="21"/>
+          <w:szCs w:val="21"/>
+        </w:rPr>
+        <w:t xml:space="preserve">Nota de lectura: el MDF ya no está en planta baja — subió al Piso 2 por prevención de inundación (ver justificación en §1). El backbone hacia el Piso 1 ahora </w:t>
+      </w:r>
+      <w:r>
+        <w:rPr>
+          <w:b/>
+          <w:bCs/>
+          <w:sz w:val="21"/>
+          <w:szCs w:val="21"/>
+        </w:rPr>
+        <w:t xml:space="preserve">baja</w:t>
+      </w:r>
+      <w:r>
+        <w:rPr>
+          <w:sz w:val="21"/>
+          <w:szCs w:val="21"/>
+        </w:rPr>
+        <w:t xml:space="preserve"> en vez de solo subir, pero la distancia vertical es la misma (1 entrepiso), así que el presupuesto de atenuación de fibra (§4.1) no cambia.</w:t>
+      </w:r>
+    </w:p>
+    <w:p>
+      <w:pPr>
         <w:pStyle w:val="Heading2"/>
         <w:spacing w:after="180" w:before="320"/>
       </w:pPr>
@@ -11355,7 +11538,7 @@
                 <w:sz w:val="19"/>
                 <w:szCs w:val="19"/>
               </w:rPr>
-              <w:t xml:space="preserve">Piso 2</w:t>
+              <w:t xml:space="preserve">Piso 1</w:t>
             </w:r>
           </w:p>
         </w:tc>
@@ -11378,7 +11561,7 @@
                 <w:sz w:val="19"/>
                 <w:szCs w:val="19"/>
               </w:rPr>
-              <w:t xml:space="preserve">52 drops</w:t>
+              <w:t xml:space="preserve">60 drops</w:t>
             </w:r>
           </w:p>
         </w:tc>
@@ -11401,7 +11584,7 @@
                 <w:sz w:val="19"/>
                 <w:szCs w:val="19"/>
               </w:rPr>
-              <w:t xml:space="preserve">~250–300 m² (estimado)</w:t>
+              <w:t xml:space="preserve">~200–250 m² (estimado — Recepción ocupa parte del área sin puestos de red)</w:t>
             </w:r>
           </w:p>
         </w:tc>
@@ -11622,6 +11805,35 @@
       <w:pPr>
         <w:spacing w:after="200"/>
       </w:pPr>
+    </w:p>
+    <w:p>
+      <w:pPr>
+        <w:spacing w:after="160"/>
+        <w:jc w:val="both"/>
+      </w:pPr>
+      <w:r>
+        <w:rPr>
+          <w:sz w:val="21"/>
+          <w:szCs w:val="21"/>
+        </w:rPr>
+        <w:t xml:space="preserve">El Piso 2 no aparece en esta tabla como IDF porque ahí ya no hay un cuarto de telecomunicaciones aparte — es directamente el </w:t>
+      </w:r>
+      <w:r>
+        <w:rPr>
+          <w:b/>
+          <w:bCs/>
+          <w:sz w:val="21"/>
+          <w:szCs w:val="21"/>
+        </w:rPr>
+        <w:t xml:space="preserve">MDF/Data Center</w:t>
+      </w:r>
+      <w:r>
+        <w:rPr>
+          <w:sz w:val="21"/>
+          <w:szCs w:val="21"/>
+        </w:rPr>
+        <w:t xml:space="preserve">, dimensionado con los criterios de 06-Data-Center-Tier4.md (más exigentes que un TR estándar: piso elevado, 2N, extinción, etc.), no con la regla básica de TIA-569-D.</w:t>
+      </w:r>
     </w:p>
     <w:p>
       <w:pPr>
@@ -13668,7 +13880,7 @@
                 <w:sz w:val="19"/>
                 <w:szCs w:val="19"/>
               </w:rPr>
-              <w:t xml:space="preserve">24 puertos Cat 6 — repartidos: 3 en MDF/Piso1 (Ventas), 3 en IDF Piso2, 5 en IDF Piso3, 5 en IDF Piso4</w:t>
+              <w:t xml:space="preserve">24 puertos Cat 6 — repartidos: 3 en IDF Piso1 (Ventas), 3 en MDF/Piso2 (Admin+Soporte), 5 en IDF Piso3, 5 en IDF Piso4</w:t>
             </w:r>
           </w:p>
         </w:tc>
@@ -13762,7 +13974,7 @@
                 <w:sz w:val="19"/>
                 <w:szCs w:val="19"/>
               </w:rPr>
-              <w:t xml:space="preserve">3 (Pisos 2, 3, 4)</w:t>
+              <w:t xml:space="preserve">3 (Pisos 1, 3, 4)</w:t>
             </w:r>
           </w:p>
         </w:tc>
@@ -13833,7 +14045,7 @@
                 <w:sz w:val="19"/>
                 <w:szCs w:val="19"/>
               </w:rPr>
-              <w:t xml:space="preserve">1 (MDF/Piso 1)</w:t>
+              <w:t xml:space="preserve">1 (MDF/Piso 2)</w:t>
             </w:r>
           </w:p>
         </w:tc>
@@ -17115,7 +17327,7 @@
           <w:sz w:val="21"/>
           <w:szCs w:val="21"/>
         </w:rPr>
-        <w:t xml:space="preserve">Todo equipo de red y servidor se inventaría con: número de serie, ubicación, fecha de compra, garantía, y responsable asignado — mantenido en NetBox (ver 00-Arquitectura-General.md).</w:t>
+        <w:t xml:space="preserve">Todo equipo de red y servidor se inventaría con: número de serie, ubicación, fecha de compra, garantía, y responsable asignado — mantenido en el inventario de activos del proyecto (hoja de cálculo compartida por ahora; un IPAM/DCIM dedicado como NetBox se evalúa como mejora de producción, no es parte del stack activo del laboratorio — ver 00-Arquitectura-General.md).</w:t>
       </w:r>
     </w:p>
     <w:p>
@@ -19149,14 +19361,47 @@
           <w:sz w:val="21"/>
           <w:szCs w:val="21"/>
         </w:rPr>
-        <w:t xml:space="preserve">Piso 1</w:t>
-      </w:r>
-      <w:r>
-        <w:rPr>
-          <w:sz w:val="21"/>
-          <w:szCs w:val="21"/>
-        </w:rPr>
-        <w:t xml:space="preserve">, sin ventanas al exterior, sin tuberías de agua ajenas al propio sistema de extinción/enfriamiento pasando por el cielo o piso del cuarto (requisito común de TIA-942/BICSI 002 para reducir riesgo de daño por agua).</w:t>
+        <w:t xml:space="preserve">Piso 2</w:t>
+      </w:r>
+      <w:r>
+        <w:rPr>
+          <w:sz w:val="21"/>
+          <w:szCs w:val="21"/>
+        </w:rPr>
+        <w:t xml:space="preserve"> — deliberadamente </w:t>
+      </w:r>
+      <w:r>
+        <w:rPr>
+          <w:b/>
+          <w:bCs/>
+          <w:sz w:val="21"/>
+          <w:szCs w:val="21"/>
+        </w:rPr>
+        <w:t xml:space="preserve">no</w:t>
+      </w:r>
+      <w:r>
+        <w:rPr>
+          <w:sz w:val="21"/>
+          <w:szCs w:val="21"/>
+        </w:rPr>
+        <w:t xml:space="preserve"> en planta baja ni en sótano. Uptime Institute y BICSI 002 desaconsejan ambas ubicaciones para instalaciones críticas: la planta baja está más expuesta a inundación (escorrentía superficial, rotura de tubería municipal, cercanía a la calle) y a mayor tránsito/acceso no controlado (recepción, entregas); el sótano añade el riesgo de nivel freático y drenaje deficiente. El Piso 2 es el primer nivel elevado del edificio — reduce el riesgo de inundación sin llevar equipo pesado (rack 42U, UPS, futura planta eléctrica) más arriba de lo necesario.</w:t>
+      </w:r>
+    </w:p>
+    <w:p>
+      <w:pPr>
+        <w:pStyle w:val="ListParagraph"/>
+        <w:numPr>
+          <w:ilvl w:val="0"/>
+          <w:numId w:val="2"/>
+        </w:numPr>
+        <w:spacing w:after="80"/>
+      </w:pPr>
+      <w:r>
+        <w:rPr>
+          <w:sz w:val="21"/>
+          <w:szCs w:val="21"/>
+        </w:rPr>
+        <w:t xml:space="preserve">Sin ventanas al exterior, sin tuberías de agua ajenas al propio sistema de extinción/enfriamiento pasando por el cielo o piso del cuarto (requisito común de TIA-942/BICSI 002 para reducir riesgo de daño por agua).</w:t>
       </w:r>
     </w:p>
     <w:p>

</xml_diff>